<commit_message>
La til Supabase-klient i JavaScript-filen og implementerte funksjonalitet for å hente og vise produkter fra databasen.
</commit_message>
<xml_diff>
--- a/Eksamen dokumentasjon.docx
+++ b/Eksamen dokumentasjon.docx
@@ -122,6 +122,159 @@
           <w:lang w:val="nb-NO"/>
         </w:rPr>
         <w:t>. På eksamensdagen kobler jeg den til den nye nettsiden, henter produktdata med JavaScript, tester at dataene vises riktig, og dokumenterer hvordan databasen brukes i løsningen.</w:t>
+      </w:r>
+    </w:p>
+    <w:p>
+      <w:pPr>
+        <w:rPr>
+          <w:lang w:val="nb-NO"/>
+        </w:rPr>
+      </w:pPr>
+    </w:p>
+    <w:p>
+      <w:pPr>
+        <w:pStyle w:val="Heading2"/>
+        <w:rPr>
+          <w:lang w:val="nb-NO"/>
+        </w:rPr>
+      </w:pPr>
+      <w:r>
+        <w:rPr>
+          <w:lang w:val="nb-NO"/>
+        </w:rPr>
+        <w:t>Feilsøking</w:t>
+      </w:r>
+    </w:p>
+    <w:p>
+      <w:pPr>
+        <w:spacing w:line="240" w:lineRule="auto"/>
+        <w:rPr>
+          <w:lang w:val="nb-NO"/>
+        </w:rPr>
+      </w:pPr>
+      <w:r>
+        <w:rPr>
+          <w:lang w:val="nb-NO"/>
+        </w:rPr>
+        <w:t>Imens jeg holdt på med koblingen med Supabase</w:t>
+      </w:r>
+      <w:r>
+        <w:rPr>
+          <w:lang w:val="nb-NO"/>
+        </w:rPr>
+        <w:t xml:space="preserve"> fikk jeg en feilmelding i Console:</w:t>
+      </w:r>
+    </w:p>
+    <w:p>
+      <w:pPr>
+        <w:spacing w:line="240" w:lineRule="auto"/>
+      </w:pPr>
+      <w:r>
+        <w:t xml:space="preserve">Uncaught </w:t>
+      </w:r>
+      <w:proofErr w:type="spellStart"/>
+      <w:r>
+        <w:t>TypeError</w:t>
+      </w:r>
+      <w:proofErr w:type="spellEnd"/>
+      <w:r>
+        <w:t>: Cannot read properties of undefined (reading '</w:t>
+      </w:r>
+      <w:proofErr w:type="spellStart"/>
+      <w:r>
+        <w:t>createClient</w:t>
+      </w:r>
+      <w:proofErr w:type="spellEnd"/>
+      <w:r>
+        <w:t>')</w:t>
+      </w:r>
+    </w:p>
+    <w:p>
+      <w:pPr>
+        <w:spacing w:line="240" w:lineRule="auto"/>
+        <w:rPr>
+          <w:lang w:val="nb-NO"/>
+        </w:rPr>
+      </w:pPr>
+      <w:r>
+        <w:rPr>
+          <w:lang w:val="nb-NO"/>
+        </w:rPr>
+        <w:t>Feilen oppstod fordi JavaScript-filen prøvde å bruke Supabase før Supabase-biblioteket var lastet inn. Jeg løste dette ved å legge til Supabase sitt CDN-script i HTML-filen før min egen script.js-fil:</w:t>
+      </w:r>
+    </w:p>
+    <w:p>
+      <w:pPr>
+        <w:spacing w:line="240" w:lineRule="auto"/>
+      </w:pPr>
+      <w:r>
+        <w:t>&lt;script src="https://cdn.jsdelivr.net/npm/@supabase/supabase-js@2"&gt;&lt;/script&gt;</w:t>
+      </w:r>
+    </w:p>
+    <w:p>
+      <w:pPr>
+        <w:spacing w:line="240" w:lineRule="auto"/>
+      </w:pPr>
+      <w:r>
+        <w:t xml:space="preserve">&lt;script </w:t>
+      </w:r>
+      <w:proofErr w:type="spellStart"/>
+      <w:r>
+        <w:t>src</w:t>
+      </w:r>
+      <w:proofErr w:type="spellEnd"/>
+      <w:r>
+        <w:t>="script.js"&gt;&lt;/script&gt;</w:t>
+      </w:r>
+    </w:p>
+    <w:p>
+      <w:pPr>
+        <w:spacing w:line="240" w:lineRule="auto"/>
+        <w:rPr>
+          <w:lang w:val="nb-NO"/>
+        </w:rPr>
+      </w:pPr>
+      <w:r>
+        <w:rPr>
+          <w:lang w:val="nb-NO"/>
+        </w:rPr>
+        <w:t xml:space="preserve">Etter dette kunne script.js bruke </w:t>
+      </w:r>
+      <w:proofErr w:type="spellStart"/>
+      <w:proofErr w:type="gramStart"/>
+      <w:r>
+        <w:rPr>
+          <w:lang w:val="nb-NO"/>
+        </w:rPr>
+        <w:t>window.supabase</w:t>
+      </w:r>
+      <w:proofErr w:type="gramEnd"/>
+      <w:r>
+        <w:rPr>
+          <w:lang w:val="nb-NO"/>
+        </w:rPr>
+        <w:t>.</w:t>
+      </w:r>
+      <w:proofErr w:type="gramStart"/>
+      <w:r>
+        <w:rPr>
+          <w:lang w:val="nb-NO"/>
+        </w:rPr>
+        <w:t>createClient</w:t>
+      </w:r>
+      <w:proofErr w:type="spellEnd"/>
+      <w:r>
+        <w:rPr>
+          <w:lang w:val="nb-NO"/>
+        </w:rPr>
+        <w:t>(</w:t>
+      </w:r>
+      <w:proofErr w:type="gramEnd"/>
+      <w:r>
+        <w:rPr>
+          <w:lang w:val="nb-NO"/>
+        </w:rPr>
+        <w:t>), og koblingen til Supabase fungerte.</w:t>
       </w:r>
     </w:p>
     <w:sectPr>

</xml_diff>

<commit_message>
Oppdatert dokumentasjon i "Eksamen dokumentasjon.docx"
</commit_message>
<xml_diff>
--- a/Eksamen dokumentasjon.docx
+++ b/Eksamen dokumentasjon.docx
@@ -4,28 +4,59 @@
   <w:body>
     <w:p>
       <w:pPr>
-        <w:pStyle w:val="Heading1"/>
-        <w:rPr>
-          <w:lang w:val="nb-NO"/>
-        </w:rPr>
-      </w:pPr>
-      <w:r>
-        <w:rPr>
-          <w:lang w:val="nb-NO"/>
-        </w:rPr>
-        <w:t>Eksamen 5.juni 2026</w:t>
-      </w:r>
-    </w:p>
-    <w:p>
-      <w:pPr>
-        <w:rPr>
-          <w:lang w:val="nb-NO"/>
-        </w:rPr>
-      </w:pPr>
-    </w:p>
-    <w:p>
-      <w:pPr>
         <w:pStyle w:val="Heading2"/>
+        <w:spacing w:line="240" w:lineRule="auto"/>
+        <w:rPr>
+          <w:lang w:val="nb-NO"/>
+        </w:rPr>
+      </w:pPr>
+      <w:r>
+        <w:rPr>
+          <w:lang w:val="nb-NO"/>
+        </w:rPr>
+        <w:t>Prosjektbeskrivelse</w:t>
+      </w:r>
+    </w:p>
+    <w:p>
+      <w:pPr>
+        <w:spacing w:line="240" w:lineRule="auto"/>
+        <w:rPr>
+          <w:lang w:val="nb-NO"/>
+        </w:rPr>
+      </w:pPr>
+      <w:r>
+        <w:rPr>
+          <w:lang w:val="nb-NO"/>
+        </w:rPr>
+        <w:t>Jeg har laget en enkel nettbutikk som heter Møbler Norge. Nettsiden viser produkter fra en database, lar brukeren legge produkter i handlekurven, regner ut totalpris og lagrer bestillinger i Supabase.</w:t>
+      </w:r>
+    </w:p>
+    <w:p>
+      <w:pPr>
+        <w:spacing w:line="240" w:lineRule="auto"/>
+        <w:rPr>
+          <w:lang w:val="nb-NO"/>
+        </w:rPr>
+      </w:pPr>
+      <w:r>
+        <w:rPr>
+          <w:lang w:val="nb-NO"/>
+        </w:rPr>
+        <w:t>Prosjektet viser utvikling gjennom HTML, CSS og JavaScript. Det viser driftsstøtte gjennom bruk av Supabase som skytjeneste/database. Det viser brukerstøtte gjennom at siden er laget enkel for brukeren, med tydelige knapper, handlekurv og meldinger hvis noe mangler.</w:t>
+      </w:r>
+    </w:p>
+    <w:p>
+      <w:pPr>
+        <w:spacing w:line="240" w:lineRule="auto"/>
+        <w:rPr>
+          <w:lang w:val="nb-NO"/>
+        </w:rPr>
+      </w:pPr>
+    </w:p>
+    <w:p>
+      <w:pPr>
+        <w:pStyle w:val="Heading2"/>
+        <w:spacing w:line="240" w:lineRule="auto"/>
         <w:rPr>
           <w:lang w:val="nb-NO"/>
         </w:rPr>
@@ -39,47 +70,261 @@
     </w:p>
     <w:p>
       <w:pPr>
-        <w:rPr>
-          <w:lang w:val="nb-NO"/>
-        </w:rPr>
-      </w:pPr>
-      <w:r>
-        <w:rPr>
-          <w:lang w:val="nb-NO"/>
-        </w:rPr>
-        <w:t xml:space="preserve">I forberedelsedelen av prosjektet gjorde jeg klart en </w:t>
+        <w:spacing w:line="240" w:lineRule="auto"/>
+        <w:rPr>
+          <w:lang w:val="nb-NO"/>
+        </w:rPr>
+      </w:pPr>
+      <w:r>
+        <w:rPr>
+          <w:lang w:val="nb-NO"/>
+        </w:rPr>
+        <w:t xml:space="preserve">I </w:t>
+      </w:r>
+      <w:r>
+        <w:rPr>
+          <w:lang w:val="nb-NO"/>
+        </w:rPr>
+        <w:t>forberedelsedelen</w:t>
+      </w:r>
+      <w:r>
+        <w:rPr>
+          <w:lang w:val="nb-NO"/>
+        </w:rPr>
+        <w:t xml:space="preserve"> gjorde jeg klart grunnlaget for prosjektet. Jeg satte opp Supabase med en produkter-tabell og en </w:t>
       </w:r>
       <w:proofErr w:type="spellStart"/>
       <w:r>
         <w:rPr>
           <w:lang w:val="nb-NO"/>
         </w:rPr>
-        <w:t>supabase</w:t>
+        <w:t>orders</w:t>
       </w:r>
       <w:proofErr w:type="spellEnd"/>
       <w:r>
         <w:rPr>
           <w:lang w:val="nb-NO"/>
         </w:rPr>
-        <w:t xml:space="preserve">, som kunne kommunisere med sånn jeg bruker </w:t>
+        <w:t>-tabell. Jeg hadde også kode fra tidligere som jeg brukte som inspirasjon, men på eksamensdagen bygde jeg nettsiden på nytt og koblet delene sammen igjen.</w:t>
+      </w:r>
+    </w:p>
+    <w:p>
+      <w:pPr>
+        <w:spacing w:line="240" w:lineRule="auto"/>
+        <w:rPr>
+          <w:lang w:val="nb-NO"/>
+        </w:rPr>
+      </w:pPr>
+    </w:p>
+    <w:p>
+      <w:pPr>
+        <w:pStyle w:val="Heading2"/>
+        <w:spacing w:line="240" w:lineRule="auto"/>
+        <w:rPr>
+          <w:lang w:val="nb-NO"/>
+        </w:rPr>
+      </w:pPr>
+      <w:r>
+        <w:rPr>
+          <w:lang w:val="nb-NO"/>
+        </w:rPr>
+        <w:t>Supabase</w:t>
+      </w:r>
+    </w:p>
+    <w:p>
+      <w:pPr>
+        <w:spacing w:line="240" w:lineRule="auto"/>
+        <w:rPr>
+          <w:lang w:val="nb-NO"/>
+        </w:rPr>
+      </w:pPr>
+      <w:r>
+        <w:rPr>
+          <w:lang w:val="nb-NO"/>
+        </w:rPr>
+        <w:t xml:space="preserve">Jeg bruker Supabase som database/skytjeneste. Produktene hentes fra produkter-tabellen. Når brukeren bestiller, lagres bestillingen i </w:t>
       </w:r>
       <w:proofErr w:type="spellStart"/>
       <w:r>
         <w:rPr>
           <w:lang w:val="nb-NO"/>
         </w:rPr>
-        <w:t>javascript</w:t>
+        <w:t>orders</w:t>
       </w:r>
       <w:proofErr w:type="spellEnd"/>
       <w:r>
         <w:rPr>
           <w:lang w:val="nb-NO"/>
         </w:rPr>
+        <w:t>-tabellen.</w:t>
+      </w:r>
+    </w:p>
+    <w:p>
+      <w:pPr>
+        <w:spacing w:line="240" w:lineRule="auto"/>
+        <w:rPr>
+          <w:lang w:val="nb-NO"/>
+        </w:rPr>
+      </w:pPr>
+      <w:r>
+        <w:rPr>
+          <w:lang w:val="nb-NO"/>
+        </w:rPr>
+        <w:t xml:space="preserve">Produkter-tabellen inneholder informasjon som navn, pris, ikon og beskrivelse. </w:t>
+      </w:r>
+      <w:proofErr w:type="spellStart"/>
+      <w:r>
+        <w:rPr>
+          <w:lang w:val="nb-NO"/>
+        </w:rPr>
+        <w:t>Orders</w:t>
+      </w:r>
+      <w:proofErr w:type="spellEnd"/>
+      <w:r>
+        <w:rPr>
+          <w:lang w:val="nb-NO"/>
+        </w:rPr>
+        <w:t>-tabellen lagrer kundeinformasjon, totalpris og hvilke produkter som ble bestilt.</w:t>
+      </w:r>
+    </w:p>
+    <w:p>
+      <w:pPr>
+        <w:spacing w:line="240" w:lineRule="auto"/>
+        <w:rPr>
+          <w:lang w:val="nb-NO"/>
+        </w:rPr>
+      </w:pPr>
+      <w:r>
+        <w:rPr>
+          <w:lang w:val="nb-NO"/>
+        </w:rPr>
+        <w:t xml:space="preserve">Jeg valgte å lagre bare nødvendig informasjon i </w:t>
+      </w:r>
+      <w:proofErr w:type="spellStart"/>
+      <w:r>
+        <w:rPr>
+          <w:lang w:val="nb-NO"/>
+        </w:rPr>
+        <w:t>items</w:t>
+      </w:r>
+      <w:proofErr w:type="spellEnd"/>
+      <w:r>
+        <w:rPr>
+          <w:lang w:val="nb-NO"/>
+        </w:rPr>
+        <w:t xml:space="preserve">-feltet i </w:t>
+      </w:r>
+      <w:proofErr w:type="spellStart"/>
+      <w:r>
+        <w:rPr>
+          <w:lang w:val="nb-NO"/>
+        </w:rPr>
+        <w:t>orders</w:t>
+      </w:r>
+      <w:proofErr w:type="spellEnd"/>
+      <w:r>
+        <w:rPr>
+          <w:lang w:val="nb-NO"/>
+        </w:rPr>
+        <w:t>-tabellen. I stedet for å lagre hele produktet, lagrer jeg bare id, navn og pris. Det gjør dataen ryddigere og enklere å forstå.</w:t>
+      </w:r>
+    </w:p>
+    <w:p>
+      <w:pPr>
+        <w:spacing w:line="240" w:lineRule="auto"/>
+        <w:rPr>
+          <w:lang w:val="nb-NO"/>
+        </w:rPr>
+      </w:pPr>
+    </w:p>
+    <w:p>
+      <w:pPr>
+        <w:pStyle w:val="Heading2"/>
+        <w:spacing w:line="240" w:lineRule="auto"/>
+        <w:rPr>
+          <w:lang w:val="nb-NO"/>
+        </w:rPr>
+      </w:pPr>
+      <w:r>
+        <w:rPr>
+          <w:lang w:val="nb-NO"/>
+        </w:rPr>
+        <w:t>Utvikling</w:t>
+      </w:r>
+    </w:p>
+    <w:p>
+      <w:pPr>
+        <w:spacing w:line="240" w:lineRule="auto"/>
+        <w:rPr>
+          <w:lang w:val="nb-NO"/>
+        </w:rPr>
+      </w:pPr>
+      <w:r>
+        <w:rPr>
+          <w:lang w:val="nb-NO"/>
+        </w:rPr>
+        <w:t xml:space="preserve">Jeg brukte HTML til å lage strukturen på nettsiden. HTML-en har </w:t>
+      </w:r>
+      <w:proofErr w:type="gramStart"/>
+      <w:r>
+        <w:rPr>
+          <w:lang w:val="nb-NO"/>
+        </w:rPr>
+        <w:t>header</w:t>
+      </w:r>
+      <w:proofErr w:type="gramEnd"/>
+      <w:r>
+        <w:rPr>
+          <w:lang w:val="nb-NO"/>
+        </w:rPr>
+        <w:t xml:space="preserve">, hero-seksjon, produktseksjon, handlekurv og </w:t>
+      </w:r>
+      <w:proofErr w:type="spellStart"/>
+      <w:r>
+        <w:rPr>
+          <w:lang w:val="nb-NO"/>
+        </w:rPr>
+        <w:t>footer</w:t>
+      </w:r>
+      <w:proofErr w:type="spellEnd"/>
+      <w:r>
+        <w:rPr>
+          <w:lang w:val="nb-NO"/>
+        </w:rPr>
         <w:t>.</w:t>
       </w:r>
     </w:p>
     <w:p>
       <w:pPr>
+        <w:spacing w:line="240" w:lineRule="auto"/>
+        <w:rPr>
+          <w:lang w:val="nb-NO"/>
+        </w:rPr>
+      </w:pPr>
+      <w:r>
+        <w:rPr>
+          <w:lang w:val="nb-NO"/>
+        </w:rPr>
+        <w:t>Jeg brukte CSS til å gjøre nettsiden mer oversiktlig og brukervennlig. CSS-en gjør at produktene vises som kort, og at input-feltene og knappene ser ryddige ut.</w:t>
+      </w:r>
+    </w:p>
+    <w:p>
+      <w:pPr>
+        <w:spacing w:line="240" w:lineRule="auto"/>
+        <w:rPr>
+          <w:lang w:val="nb-NO"/>
+        </w:rPr>
+      </w:pPr>
+      <w:r>
+        <w:rPr>
+          <w:lang w:val="nb-NO"/>
+        </w:rPr>
+        <w:t>Jeg brukte JavaScript til funksjonaliteten. JavaScript henter produkter fra Supabase, viser produktene på siden, legger produkter i handlekurven, regner ut totalpris, tømmer handlekurven og sender bestilling til Supabase.</w:t>
+      </w:r>
+    </w:p>
+    <w:p>
+      <w:pPr>
+        <w:spacing w:line="240" w:lineRule="auto"/>
         <w:rPr>
           <w:lang w:val="nb-NO"/>
         </w:rPr>
@@ -88,44 +333,50 @@
     <w:p>
       <w:pPr>
         <w:pStyle w:val="Heading2"/>
-        <w:rPr>
-          <w:lang w:val="nb-NO"/>
-        </w:rPr>
-      </w:pPr>
-      <w:r>
-        <w:rPr>
-          <w:lang w:val="nb-NO"/>
-        </w:rPr>
-        <w:t>Supabase</w:t>
-      </w:r>
-    </w:p>
-    <w:p>
-      <w:pPr>
-        <w:rPr>
-          <w:lang w:val="nb-NO"/>
-        </w:rPr>
-      </w:pPr>
-      <w:r>
-        <w:rPr>
-          <w:lang w:val="nb-NO"/>
-        </w:rPr>
-        <w:t xml:space="preserve">Jeg bruker en Supabase-database som ble satt opp i </w:t>
-      </w:r>
-      <w:r>
-        <w:rPr>
-          <w:lang w:val="nb-NO"/>
-        </w:rPr>
-        <w:t>forberedelsedelen</w:t>
-      </w:r>
-      <w:r>
-        <w:rPr>
-          <w:lang w:val="nb-NO"/>
-        </w:rPr>
-        <w:t>. På eksamensdagen kobler jeg den til den nye nettsiden, henter produktdata med JavaScript, tester at dataene vises riktig, og dokumenterer hvordan databasen brukes i løsningen.</w:t>
-      </w:r>
-    </w:p>
-    <w:p>
-      <w:pPr>
+        <w:spacing w:line="240" w:lineRule="auto"/>
+        <w:rPr>
+          <w:lang w:val="nb-NO"/>
+        </w:rPr>
+      </w:pPr>
+      <w:r>
+        <w:rPr>
+          <w:lang w:val="nb-NO"/>
+        </w:rPr>
+        <w:lastRenderedPageBreak/>
+        <w:t>Brukerstøtte</w:t>
+      </w:r>
+    </w:p>
+    <w:p>
+      <w:pPr>
+        <w:spacing w:line="240" w:lineRule="auto"/>
+        <w:rPr>
+          <w:lang w:val="nb-NO"/>
+        </w:rPr>
+      </w:pPr>
+      <w:r>
+        <w:rPr>
+          <w:lang w:val="nb-NO"/>
+        </w:rPr>
+        <w:t>Nettsiden er laget for at brukeren enkelt skal kunne forstå hva de skal gjøre. Brukeren kan trykke på “Se produkter”, legge produkter i handlekurven, fylle inn navn, e-post og adresse, og trykke “Bestill”.</w:t>
+      </w:r>
+    </w:p>
+    <w:p>
+      <w:pPr>
+        <w:spacing w:line="240" w:lineRule="auto"/>
+        <w:rPr>
+          <w:lang w:val="nb-NO"/>
+        </w:rPr>
+      </w:pPr>
+      <w:r>
+        <w:rPr>
+          <w:lang w:val="nb-NO"/>
+        </w:rPr>
+        <w:t>Jeg har lagt inn meldinger til brukeren. For eksempel får brukeren beskjed hvis handlekurven er tom, hvis de mangler navn, e-post eller adresse, eller hvis bestillingen er fullført.</w:t>
+      </w:r>
+    </w:p>
+    <w:p>
+      <w:pPr>
+        <w:spacing w:line="240" w:lineRule="auto"/>
         <w:rPr>
           <w:lang w:val="nb-NO"/>
         </w:rPr>
@@ -134,14 +385,300 @@
     <w:p>
       <w:pPr>
         <w:pStyle w:val="Heading2"/>
-        <w:rPr>
-          <w:lang w:val="nb-NO"/>
-        </w:rPr>
-      </w:pPr>
-      <w:r>
-        <w:rPr>
-          <w:lang w:val="nb-NO"/>
-        </w:rPr>
+        <w:spacing w:line="240" w:lineRule="auto"/>
+        <w:rPr>
+          <w:lang w:val="nb-NO"/>
+        </w:rPr>
+      </w:pPr>
+      <w:r>
+        <w:rPr>
+          <w:lang w:val="nb-NO"/>
+        </w:rPr>
+        <w:t>Driftsstøtte</w:t>
+      </w:r>
+    </w:p>
+    <w:p>
+      <w:pPr>
+        <w:spacing w:line="240" w:lineRule="auto"/>
+        <w:rPr>
+          <w:lang w:val="nb-NO"/>
+        </w:rPr>
+      </w:pPr>
+      <w:r>
+        <w:rPr>
+          <w:lang w:val="nb-NO"/>
+        </w:rPr>
+        <w:t>Løsningen bruker Supabase som en ekstern skytjeneste. Nettsiden kommuniserer med Supabase gjennom JavaScript og Supabase-klienten.</w:t>
+      </w:r>
+    </w:p>
+    <w:p>
+      <w:pPr>
+        <w:spacing w:line="240" w:lineRule="auto"/>
+        <w:rPr>
+          <w:lang w:val="nb-NO"/>
+        </w:rPr>
+      </w:pPr>
+      <w:r>
+        <w:rPr>
+          <w:lang w:val="nb-NO"/>
+        </w:rPr>
+        <w:t>Jeg måtte passe på at Supabase-scriptet ble lastet inn før min egen script.js-fil. Hvis ikke klarte ikke JavaScript å bruke Supabase.</w:t>
+      </w:r>
+    </w:p>
+    <w:p>
+      <w:pPr>
+        <w:spacing w:line="240" w:lineRule="auto"/>
+        <w:rPr>
+          <w:lang w:val="nb-NO"/>
+        </w:rPr>
+      </w:pPr>
+      <w:r>
+        <w:rPr>
+          <w:lang w:val="nb-NO"/>
+        </w:rPr>
+        <w:t xml:space="preserve">En viktig </w:t>
+      </w:r>
+      <w:proofErr w:type="spellStart"/>
+      <w:r>
+        <w:rPr>
+          <w:lang w:val="nb-NO"/>
+        </w:rPr>
+        <w:t>sikkerhetsting</w:t>
+      </w:r>
+      <w:proofErr w:type="spellEnd"/>
+      <w:r>
+        <w:rPr>
+          <w:lang w:val="nb-NO"/>
+        </w:rPr>
+        <w:t xml:space="preserve"> er at databasen må ha riktige regler/</w:t>
+      </w:r>
+      <w:proofErr w:type="spellStart"/>
+      <w:r>
+        <w:rPr>
+          <w:lang w:val="nb-NO"/>
+        </w:rPr>
+        <w:t>policies</w:t>
+      </w:r>
+      <w:proofErr w:type="spellEnd"/>
+      <w:r>
+        <w:rPr>
+          <w:lang w:val="nb-NO"/>
+        </w:rPr>
+        <w:t>. Hvis tabeller er åpne feil, kan brukere få tilgang til data de ikke burde ha. I en ekte nettbutikk måtte jeg hatt bedre innlogging, bedre validering og mer kontroll på hvem som kan lese og skrive data.</w:t>
+      </w:r>
+    </w:p>
+    <w:p>
+      <w:pPr>
+        <w:spacing w:line="240" w:lineRule="auto"/>
+        <w:rPr>
+          <w:lang w:val="nb-NO"/>
+        </w:rPr>
+      </w:pPr>
+    </w:p>
+    <w:p>
+      <w:pPr>
+        <w:pStyle w:val="Heading2"/>
+        <w:spacing w:line="240" w:lineRule="auto"/>
+        <w:rPr>
+          <w:lang w:val="nb-NO"/>
+        </w:rPr>
+      </w:pPr>
+      <w:r>
+        <w:rPr>
+          <w:lang w:val="nb-NO"/>
+        </w:rPr>
+        <w:t>Testing</w:t>
+      </w:r>
+    </w:p>
+    <w:p>
+      <w:pPr>
+        <w:spacing w:line="240" w:lineRule="auto"/>
+        <w:rPr>
+          <w:lang w:val="nb-NO"/>
+        </w:rPr>
+      </w:pPr>
+      <w:r>
+        <w:rPr>
+          <w:lang w:val="nb-NO"/>
+        </w:rPr>
+        <w:t>Jeg testet at:</w:t>
+      </w:r>
+    </w:p>
+    <w:p>
+      <w:pPr>
+        <w:spacing w:line="240" w:lineRule="auto"/>
+        <w:rPr>
+          <w:lang w:val="nb-NO"/>
+        </w:rPr>
+      </w:pPr>
+      <w:r>
+        <w:rPr>
+          <w:lang w:val="nb-NO"/>
+        </w:rPr>
+        <w:t>* nettsiden laster inn uten feil</w:t>
+      </w:r>
+    </w:p>
+    <w:p>
+      <w:pPr>
+        <w:spacing w:line="240" w:lineRule="auto"/>
+        <w:rPr>
+          <w:lang w:val="nb-NO"/>
+        </w:rPr>
+      </w:pPr>
+      <w:r>
+        <w:rPr>
+          <w:lang w:val="nb-NO"/>
+        </w:rPr>
+        <w:t>* produktene hentes fra Supabase</w:t>
+      </w:r>
+    </w:p>
+    <w:p>
+      <w:pPr>
+        <w:spacing w:line="240" w:lineRule="auto"/>
+        <w:rPr>
+          <w:lang w:val="nb-NO"/>
+        </w:rPr>
+      </w:pPr>
+      <w:r>
+        <w:rPr>
+          <w:lang w:val="nb-NO"/>
+        </w:rPr>
+        <w:t>* produktene vises på nettsiden</w:t>
+      </w:r>
+    </w:p>
+    <w:p>
+      <w:pPr>
+        <w:spacing w:line="240" w:lineRule="auto"/>
+        <w:rPr>
+          <w:lang w:val="nb-NO"/>
+        </w:rPr>
+      </w:pPr>
+      <w:r>
+        <w:rPr>
+          <w:lang w:val="nb-NO"/>
+        </w:rPr>
+        <w:t>* produktikonene vises</w:t>
+      </w:r>
+    </w:p>
+    <w:p>
+      <w:pPr>
+        <w:spacing w:line="240" w:lineRule="auto"/>
+        <w:rPr>
+          <w:lang w:val="nb-NO"/>
+        </w:rPr>
+      </w:pPr>
+      <w:r>
+        <w:rPr>
+          <w:lang w:val="nb-NO"/>
+        </w:rPr>
+        <w:t>* produkter kan legges i handlekurven</w:t>
+      </w:r>
+    </w:p>
+    <w:p>
+      <w:pPr>
+        <w:spacing w:line="240" w:lineRule="auto"/>
+        <w:rPr>
+          <w:lang w:val="nb-NO"/>
+        </w:rPr>
+      </w:pPr>
+      <w:r>
+        <w:rPr>
+          <w:lang w:val="nb-NO"/>
+        </w:rPr>
+        <w:t>* totalprisen oppdateres</w:t>
+      </w:r>
+    </w:p>
+    <w:p>
+      <w:pPr>
+        <w:spacing w:line="240" w:lineRule="auto"/>
+        <w:rPr>
+          <w:lang w:val="nb-NO"/>
+        </w:rPr>
+      </w:pPr>
+      <w:r>
+        <w:rPr>
+          <w:lang w:val="nb-NO"/>
+        </w:rPr>
+        <w:t>* tøm-knappen fungerer</w:t>
+      </w:r>
+    </w:p>
+    <w:p>
+      <w:pPr>
+        <w:spacing w:line="240" w:lineRule="auto"/>
+        <w:rPr>
+          <w:lang w:val="nb-NO"/>
+        </w:rPr>
+      </w:pPr>
+      <w:r>
+        <w:rPr>
+          <w:lang w:val="nb-NO"/>
+        </w:rPr>
+        <w:t>* bestill-knappen ikke fungerer hvis handlekurven er tom</w:t>
+      </w:r>
+    </w:p>
+    <w:p>
+      <w:pPr>
+        <w:spacing w:line="240" w:lineRule="auto"/>
+        <w:rPr>
+          <w:lang w:val="nb-NO"/>
+        </w:rPr>
+      </w:pPr>
+      <w:r>
+        <w:rPr>
+          <w:lang w:val="nb-NO"/>
+        </w:rPr>
+        <w:t>* brukeren må fylle inn navn, e-post og adresse</w:t>
+      </w:r>
+    </w:p>
+    <w:p>
+      <w:pPr>
+        <w:spacing w:line="240" w:lineRule="auto"/>
+        <w:rPr>
+          <w:lang w:val="nb-NO"/>
+        </w:rPr>
+      </w:pPr>
+      <w:r>
+        <w:rPr>
+          <w:lang w:val="nb-NO"/>
+        </w:rPr>
+        <w:t xml:space="preserve">* bestillingen lagres i </w:t>
+      </w:r>
+      <w:proofErr w:type="spellStart"/>
+      <w:r>
+        <w:rPr>
+          <w:lang w:val="nb-NO"/>
+        </w:rPr>
+        <w:t>orders</w:t>
+      </w:r>
+      <w:proofErr w:type="spellEnd"/>
+      <w:r>
+        <w:rPr>
+          <w:lang w:val="nb-NO"/>
+        </w:rPr>
+        <w:t>-tabellen i Supabase</w:t>
+      </w:r>
+    </w:p>
+    <w:p>
+      <w:pPr>
+        <w:spacing w:line="240" w:lineRule="auto"/>
+        <w:rPr>
+          <w:lang w:val="nb-NO"/>
+        </w:rPr>
+      </w:pPr>
+    </w:p>
+    <w:p>
+      <w:pPr>
+        <w:pStyle w:val="Heading2"/>
+        <w:spacing w:line="240" w:lineRule="auto"/>
+        <w:rPr>
+          <w:lang w:val="nb-NO"/>
+        </w:rPr>
+      </w:pPr>
+      <w:r>
+        <w:rPr>
+          <w:lang w:val="nb-NO"/>
+        </w:rPr>
+        <w:lastRenderedPageBreak/>
         <w:t>Feilsøking</w:t>
       </w:r>
     </w:p>
@@ -156,125 +693,148 @@
         <w:rPr>
           <w:lang w:val="nb-NO"/>
         </w:rPr>
-        <w:t>Imens jeg holdt på med koblingen med Supabase</w:t>
-      </w:r>
-      <w:r>
-        <w:rPr>
-          <w:lang w:val="nb-NO"/>
-        </w:rPr>
-        <w:t xml:space="preserve"> fikk jeg en feilmelding i Console:</w:t>
-      </w:r>
-    </w:p>
-    <w:p>
-      <w:pPr>
-        <w:spacing w:line="240" w:lineRule="auto"/>
-      </w:pPr>
-      <w:r>
-        <w:t xml:space="preserve">Uncaught </w:t>
+        <w:t>Jeg fikk en feil der Supabase ikke fungerte i Console. Feilen kom fordi script.js prøvde å bruke Supabase før Supabase-biblioteket var lastet inn. Jeg løste dette ved å legge Supabase-scriptet inn før min egen JavaScript-fil i HTML-en.</w:t>
+      </w:r>
+    </w:p>
+    <w:p>
+      <w:pPr>
+        <w:spacing w:line="240" w:lineRule="auto"/>
+        <w:rPr>
+          <w:lang w:val="nb-NO"/>
+        </w:rPr>
+      </w:pPr>
+      <w:r>
+        <w:rPr>
+          <w:lang w:val="nb-NO"/>
+        </w:rPr>
+        <w:t xml:space="preserve">Jeg fikk også en feil da jeg prøvde å hente fra </w:t>
       </w:r>
       <w:proofErr w:type="spellStart"/>
       <w:r>
-        <w:t>TypeError</w:t>
+        <w:rPr>
+          <w:lang w:val="nb-NO"/>
+        </w:rPr>
+        <w:t>profiles</w:t>
       </w:r>
       <w:proofErr w:type="spellEnd"/>
       <w:r>
-        <w:t>: Cannot read properties of undefined (reading '</w:t>
+        <w:rPr>
+          <w:lang w:val="nb-NO"/>
+        </w:rPr>
+        <w:t xml:space="preserve">-tabellen. Da fant jeg ut at jeg faktisk ikke hadde en </w:t>
       </w:r>
       <w:proofErr w:type="spellStart"/>
       <w:r>
-        <w:t>createClient</w:t>
+        <w:rPr>
+          <w:lang w:val="nb-NO"/>
+        </w:rPr>
+        <w:t>profiles</w:t>
       </w:r>
       <w:proofErr w:type="spellEnd"/>
       <w:r>
-        <w:t>')</w:t>
-      </w:r>
-    </w:p>
-    <w:p>
-      <w:pPr>
-        <w:spacing w:line="240" w:lineRule="auto"/>
-        <w:rPr>
-          <w:lang w:val="nb-NO"/>
-        </w:rPr>
-      </w:pPr>
-      <w:r>
-        <w:rPr>
-          <w:lang w:val="nb-NO"/>
-        </w:rPr>
-        <w:t>Feilen oppstod fordi JavaScript-filen prøvde å bruke Supabase før Supabase-biblioteket var lastet inn. Jeg løste dette ved å legge til Supabase sitt CDN-script i HTML-filen før min egen script.js-fil:</w:t>
-      </w:r>
-    </w:p>
-    <w:p>
-      <w:pPr>
-        <w:spacing w:line="240" w:lineRule="auto"/>
-      </w:pPr>
-      <w:r>
-        <w:t>&lt;script src="https://cdn.jsdelivr.net/npm/@supabase/supabase-js@2"&gt;&lt;/script&gt;</w:t>
-      </w:r>
-    </w:p>
-    <w:p>
-      <w:pPr>
-        <w:spacing w:line="240" w:lineRule="auto"/>
-      </w:pPr>
-      <w:r>
-        <w:t xml:space="preserve">&lt;script </w:t>
+        <w:rPr>
+          <w:lang w:val="nb-NO"/>
+        </w:rPr>
+        <w:t xml:space="preserve">-tabell i Supabase. Jeg hadde </w:t>
       </w:r>
       <w:proofErr w:type="spellStart"/>
       <w:r>
-        <w:t>src</w:t>
+        <w:rPr>
+          <w:lang w:val="nb-NO"/>
+        </w:rPr>
+        <w:t>orders</w:t>
       </w:r>
       <w:proofErr w:type="spellEnd"/>
       <w:r>
-        <w:t>="script.js"&gt;&lt;/script&gt;</w:t>
-      </w:r>
-    </w:p>
-    <w:p>
-      <w:pPr>
-        <w:spacing w:line="240" w:lineRule="auto"/>
-        <w:rPr>
-          <w:lang w:val="nb-NO"/>
-        </w:rPr>
-      </w:pPr>
-      <w:r>
-        <w:rPr>
-          <w:lang w:val="nb-NO"/>
-        </w:rPr>
-        <w:t xml:space="preserve">Etter dette kunne script.js bruke </w:t>
+        <w:rPr>
+          <w:lang w:val="nb-NO"/>
+        </w:rPr>
+        <w:t xml:space="preserve"> og produkter. Derfor fjernet jeg </w:t>
       </w:r>
       <w:proofErr w:type="spellStart"/>
-      <w:proofErr w:type="gramStart"/>
-      <w:r>
-        <w:rPr>
-          <w:lang w:val="nb-NO"/>
-        </w:rPr>
-        <w:t>window.supabase</w:t>
-      </w:r>
-      <w:proofErr w:type="gramEnd"/>
+      <w:r>
+        <w:rPr>
+          <w:lang w:val="nb-NO"/>
+        </w:rPr>
+        <w:t>profiles</w:t>
+      </w:r>
+      <w:proofErr w:type="spellEnd"/>
+      <w:r>
+        <w:rPr>
+          <w:lang w:val="nb-NO"/>
+        </w:rPr>
+        <w:t xml:space="preserve">-koden og brukte heller </w:t>
+      </w:r>
+      <w:proofErr w:type="spellStart"/>
+      <w:r>
+        <w:rPr>
+          <w:lang w:val="nb-NO"/>
+        </w:rPr>
+        <w:t>orders</w:t>
+      </w:r>
+      <w:proofErr w:type="spellEnd"/>
+      <w:r>
+        <w:rPr>
+          <w:lang w:val="nb-NO"/>
+        </w:rPr>
+        <w:t>-tabellen til bestillinger.</w:t>
+      </w:r>
+    </w:p>
+    <w:p>
+      <w:pPr>
+        <w:spacing w:line="240" w:lineRule="auto"/>
+        <w:rPr>
+          <w:lang w:val="nb-NO"/>
+        </w:rPr>
+      </w:pPr>
+    </w:p>
+    <w:p>
+      <w:pPr>
+        <w:pStyle w:val="Heading2"/>
+        <w:spacing w:line="240" w:lineRule="auto"/>
+        <w:rPr>
+          <w:lang w:val="nb-NO"/>
+        </w:rPr>
+      </w:pPr>
+      <w:r>
+        <w:rPr>
+          <w:lang w:val="nb-NO"/>
+        </w:rPr>
+        <w:t>Egenvurdering</w:t>
+      </w:r>
+    </w:p>
+    <w:p>
+      <w:pPr>
+        <w:spacing w:line="240" w:lineRule="auto"/>
+        <w:rPr>
+          <w:lang w:val="nb-NO"/>
+        </w:rPr>
+      </w:pPr>
+      <w:r>
+        <w:rPr>
+          <w:lang w:val="nb-NO"/>
+        </w:rPr>
+        <w:t>Jeg synes løsningen fungerer bra som en enkel nettbutikk. Jeg har fått vist HTML, CSS, JavaScript, database, handlekurv, bestilling, testing og feilsøking.</w:t>
+      </w:r>
+    </w:p>
+    <w:p>
+      <w:pPr>
+        <w:spacing w:line="240" w:lineRule="auto"/>
+        <w:rPr>
+          <w:lang w:val="nb-NO"/>
+        </w:rPr>
+      </w:pPr>
+      <w:r>
+        <w:rPr>
+          <w:lang w:val="nb-NO"/>
+        </w:rPr>
+        <w:t>Hvis jeg hadde hatt mer tid, ville jeg lagt til innlogging, bedre design, fjern-knapp for enkeltprodukter i handlekurven, bedre e-postvalidering og bedre sikkerhet rundt bestillinger.</w:t>
+      </w:r>
       <w:r>
         <w:rPr>
           <w:lang w:val="nb-NO"/>
         </w:rPr>
         <w:t>.</w:t>
-      </w:r>
-      <w:proofErr w:type="gramStart"/>
-      <w:r>
-        <w:rPr>
-          <w:lang w:val="nb-NO"/>
-        </w:rPr>
-        <w:t>createClient</w:t>
-      </w:r>
-      <w:proofErr w:type="spellEnd"/>
-      <w:r>
-        <w:rPr>
-          <w:lang w:val="nb-NO"/>
-        </w:rPr>
-        <w:t>(</w:t>
-      </w:r>
-      <w:proofErr w:type="gramEnd"/>
-      <w:r>
-        <w:rPr>
-          <w:lang w:val="nb-NO"/>
-        </w:rPr>
-        <w:t>), og koblingen til Supabase fungerte.</w:t>
       </w:r>
     </w:p>
     <w:sectPr>

</xml_diff>